<commit_message>
Started projects. Added Figma bridge
</commit_message>
<xml_diff>
--- a/Presto PRD v1.1.docx
+++ b/Presto PRD v1.1.docx
@@ -2388,6 +2388,26 @@
           <w:sz w:val="22"/>
           <w:szCs w:val="22"/>
         </w:rPr>
+        <w:t xml:space="preserve">/create-project — first-run screen shown after login when the account has no projects (see 5.3)</w:t>
+      </w:r>
+    </w:p>
+    <w:p>
+      <w:pPr>
+        <w:pStyle w:val="ListParagraph"/>
+        <w:numPr>
+          <w:ilvl w:val="0"/>
+          <w:numId w:val="2"/>
+        </w:numPr>
+        <w:spacing w:after="40" w:before="40"/>
+      </w:pPr>
+      <w:r>
+        <w:rPr>
+          <w:rFonts w:ascii="Arial" w:cs="Arial" w:eastAsia="Arial" w:hAnsi="Arial"/>
+          <w:b w:val="false"/>
+          <w:bCs w:val="false"/>
+          <w:sz w:val="22"/>
+          <w:szCs w:val="22"/>
+        </w:rPr>
         <w:t xml:space="preserve">/dashboard — default redirect after login, monthly summary</w:t>
       </w:r>
     </w:p>
@@ -2589,6 +2609,118 @@
     </w:p>
     <w:p>
       <w:pPr>
+        <w:pStyle w:val="Heading2"/>
+        <w:spacing w:after="120" w:before="280"/>
+      </w:pPr>
+      <w:r>
+        <w:rPr>
+          <w:rFonts w:ascii="Arial" w:cs="Arial" w:eastAsia="Arial" w:hAnsi="Arial"/>
+          <w:b/>
+          <w:bCs/>
+          <w:color w:val="1A1A1F"/>
+          <w:sz w:val="26"/>
+          <w:szCs w:val="26"/>
+        </w:rPr>
+        <w:t xml:space="preserve">5.3 Projects</w:t>
+      </w:r>
+    </w:p>
+    <w:p>
+      <w:pPr>
+        <w:spacing w:after="80" w:before="40"/>
+      </w:pPr>
+      <w:r>
+        <w:rPr>
+          <w:rFonts w:ascii="Arial" w:cs="Arial" w:eastAsia="Arial" w:hAnsi="Arial"/>
+          <w:b w:val="false"/>
+          <w:bCs w:val="false"/>
+          <w:sz w:val="22"/>
+          <w:szCs w:val="22"/>
+        </w:rPr>
+        <w:t xml:space="preserve">A project is the top-level container in Presto — think of it as a folder. Everything the app does happens inside a project: the dashboard, content calendar, generation, and instructions &amp; resources are all scoped to the project the user is working in. A user can create multiple projects to run separate content generation schemes side by side — for example, a personal LinkedIn brand and a product account — each with its own voice, resources, and calendar.</w:t>
+      </w:r>
+    </w:p>
+    <w:p>
+      <w:pPr>
+        <w:pStyle w:val="ListParagraph"/>
+        <w:numPr>
+          <w:ilvl w:val="0"/>
+          <w:numId w:val="2"/>
+        </w:numPr>
+        <w:spacing w:after="40" w:before="40"/>
+      </w:pPr>
+      <w:r>
+        <w:rPr>
+          <w:rFonts w:ascii="Arial" w:cs="Arial" w:eastAsia="Arial" w:hAnsi="Arial"/>
+          <w:b w:val="false"/>
+          <w:bCs w:val="false"/>
+          <w:sz w:val="22"/>
+          <w:szCs w:val="22"/>
+        </w:rPr>
+        <w:t xml:space="preserve">One account can hold any number of projects; content, instructions, and configuration never leak between them</w:t>
+      </w:r>
+    </w:p>
+    <w:p>
+      <w:pPr>
+        <w:pStyle w:val="ListParagraph"/>
+        <w:numPr>
+          <w:ilvl w:val="0"/>
+          <w:numId w:val="2"/>
+        </w:numPr>
+        <w:spacing w:after="40" w:before="40"/>
+      </w:pPr>
+      <w:r>
+        <w:rPr>
+          <w:rFonts w:ascii="Arial" w:cs="Arial" w:eastAsia="Arial" w:hAnsi="Arial"/>
+          <w:b w:val="false"/>
+          <w:bCs w:val="false"/>
+          <w:sz w:val="22"/>
+          <w:szCs w:val="22"/>
+        </w:rPr>
+        <w:t xml:space="preserve">The sidebar sections (Dashboard, Instructions, Generate, Content Calendar, Connections) always operate on the currently active project</w:t>
+      </w:r>
+    </w:p>
+    <w:p>
+      <w:pPr>
+        <w:pStyle w:val="ListParagraph"/>
+        <w:numPr>
+          <w:ilvl w:val="0"/>
+          <w:numId w:val="2"/>
+        </w:numPr>
+        <w:spacing w:after="40" w:before="40"/>
+      </w:pPr>
+      <w:r>
+        <w:rPr>
+          <w:rFonts w:ascii="Arial" w:cs="Arial" w:eastAsia="Arial" w:hAnsi="Arial"/>
+          <w:b w:val="false"/>
+          <w:bCs w:val="false"/>
+          <w:sz w:val="22"/>
+          <w:szCs w:val="22"/>
+        </w:rPr>
+        <w:t xml:space="preserve">After login, a user with no projects lands on the Create Project screen; a user with at least one project lands in a project dashboard</w:t>
+      </w:r>
+    </w:p>
+    <w:p>
+      <w:pPr>
+        <w:pStyle w:val="ListParagraph"/>
+        <w:numPr>
+          <w:ilvl w:val="0"/>
+          <w:numId w:val="2"/>
+        </w:numPr>
+        <w:spacing w:after="40" w:before="40"/>
+      </w:pPr>
+      <w:r>
+        <w:rPr>
+          <w:rFonts w:ascii="Arial" w:cs="Arial" w:eastAsia="Arial" w:hAnsi="Arial"/>
+          <w:b w:val="false"/>
+          <w:bCs w:val="false"/>
+          <w:sz w:val="22"/>
+          <w:szCs w:val="22"/>
+        </w:rPr>
+        <w:t xml:space="preserve">Whether platform connections and account settings are per-project or account-level is an open question (see 11)</w:t>
+      </w:r>
+    </w:p>
+    <w:p>
+      <w:pPr>
         <w:pStyle w:val="Heading1"/>
         <w:pBdr>
           <w:bottom w:val="single" w:color="4A5ADB" w:sz="6" w:space="6"/>
@@ -2718,7 +2850,7 @@
           <w:sz w:val="22"/>
           <w:szCs w:val="22"/>
         </w:rPr>
-        <w:t xml:space="preserve">Redirects to /dashboard on success</w:t>
+        <w:t xml:space="preserve">On success: redirects to the active project’s /dashboard, or to the Create Project screen if the account has no projects yet (see 5.3)</w:t>
       </w:r>
     </w:p>
     <w:p>
@@ -2803,7 +2935,7 @@
           <w:sz w:val="22"/>
           <w:szCs w:val="22"/>
         </w:rPr>
-        <w:t xml:space="preserve">First login redirects to /instructions to prompt setup</w:t>
+        <w:t xml:space="preserve">First login lands on the Create Project screen (a new account has no projects); after the first project is created, redirect to /instructions to prompt setup</w:t>
       </w:r>
     </w:p>
     <w:p>
@@ -9033,6 +9165,86 @@
           <w:szCs w:val="22"/>
         </w:rPr>
         <w:t xml:space="preserve">For cross-posting (Phase 2): should each platform get its own content variant, or the same copy?</w:t>
+      </w:r>
+    </w:p>
+    <w:p>
+      <w:pPr>
+        <w:pStyle w:val="ListParagraph"/>
+        <w:numPr>
+          <w:ilvl w:val="0"/>
+          <w:numId w:val="2"/>
+        </w:numPr>
+        <w:spacing w:after="40" w:before="40"/>
+      </w:pPr>
+      <w:r>
+        <w:rPr>
+          <w:rFonts w:ascii="Arial" w:cs="Arial" w:eastAsia="Arial" w:hAnsi="Arial"/>
+          <w:b w:val="false"/>
+          <w:bCs w:val="false"/>
+          <w:sz w:val="22"/>
+          <w:szCs w:val="22"/>
+        </w:rPr>
+        <w:t xml:space="preserve">Projects: what does the user configure at creation time — a name only, or platform and instructions seed as well?</w:t>
+      </w:r>
+    </w:p>
+    <w:p>
+      <w:pPr>
+        <w:pStyle w:val="ListParagraph"/>
+        <w:numPr>
+          <w:ilvl w:val="0"/>
+          <w:numId w:val="2"/>
+        </w:numPr>
+        <w:spacing w:after="40" w:before="40"/>
+      </w:pPr>
+      <w:r>
+        <w:rPr>
+          <w:rFonts w:ascii="Arial" w:cs="Arial" w:eastAsia="Arial" w:hAnsi="Arial"/>
+          <w:b w:val="false"/>
+          <w:bCs w:val="false"/>
+          <w:sz w:val="22"/>
+          <w:szCs w:val="22"/>
+        </w:rPr>
+        <w:t xml:space="preserve">Projects: are platform connections and account settings per-project or account-level?</w:t>
+      </w:r>
+    </w:p>
+    <w:p>
+      <w:pPr>
+        <w:pStyle w:val="ListParagraph"/>
+        <w:numPr>
+          <w:ilvl w:val="0"/>
+          <w:numId w:val="2"/>
+        </w:numPr>
+        <w:spacing w:after="40" w:before="40"/>
+      </w:pPr>
+      <w:r>
+        <w:rPr>
+          <w:rFonts w:ascii="Arial" w:cs="Arial" w:eastAsia="Arial" w:hAnsi="Arial"/>
+          <w:b w:val="false"/>
+          <w:bCs w:val="false"/>
+          <w:sz w:val="22"/>
+          <w:szCs w:val="22"/>
+        </w:rPr>
+        <w:t xml:space="preserve">Projects: where does switching live once an account has more than one — sidebar, navbar, or a dedicated switcher?</w:t>
+      </w:r>
+    </w:p>
+    <w:p>
+      <w:pPr>
+        <w:pStyle w:val="ListParagraph"/>
+        <w:numPr>
+          <w:ilvl w:val="0"/>
+          <w:numId w:val="2"/>
+        </w:numPr>
+        <w:spacing w:after="40" w:before="40"/>
+      </w:pPr>
+      <w:r>
+        <w:rPr>
+          <w:rFonts w:ascii="Arial" w:cs="Arial" w:eastAsia="Arial" w:hAnsi="Arial"/>
+          <w:b w:val="false"/>
+          <w:bCs w:val="false"/>
+          <w:sz w:val="22"/>
+          <w:szCs w:val="22"/>
+        </w:rPr>
+        <w:t xml:space="preserve">Projects: can a project be renamed, archived, or deleted — and what happens to its scheduled posts?</w:t>
       </w:r>
     </w:p>
     <w:p>

</xml_diff>